<commit_message>
Fix Bug (Checklist TV1)
</commit_message>
<xml_diff>
--- a/docs/Checklist công việc Nhóm 4 .docx
+++ b/docs/Checklist công việc Nhóm 4 .docx
@@ -359,7 +359,27 @@
           <w:szCs w:val="30"/>
           <w:lang w:val="vi-VN"/>
         </w:rPr>
-        <w:t>Từng thành viên hoàn thành Checklist theo thứ tự, tuân thủ Deadline. Tuyệt đối không 2 hoặc hơn 2 thanh viên được làm bài cùng 1 lúc.</w:t>
+        <w:t>Từng thành viên hoàn thành Checklist theo thứ tự, tuân thủ Deadline. Tuyệt đối không 2 hoặc hơn 2 th</w:t>
+      </w:r>
+      <w:r>
+        <w:rPr>
+          <w:rFonts w:ascii="Times New Roman" w:eastAsia="Meiryo" w:hAnsi="Times New Roman" w:cs="Times New Roman"/>
+          <w:sz w:val="30"/>
+          <w:szCs w:val="30"/>
+          <w:lang w:val="vi-VN"/>
+        </w:rPr>
+        <w:t>à</w:t>
+      </w:r>
+      <w:bookmarkStart w:id="0" w:name="_GoBack"/>
+      <w:bookmarkEnd w:id="0"/>
+      <w:r>
+        <w:rPr>
+          <w:rFonts w:ascii="Times New Roman" w:eastAsia="Meiryo" w:hAnsi="Times New Roman" w:cs="Times New Roman"/>
+          <w:sz w:val="30"/>
+          <w:szCs w:val="30"/>
+          <w:lang w:val="vi-VN"/>
+        </w:rPr>
+        <w:t>nh viên được làm bài cùng 1 lúc.</w:t>
       </w:r>
     </w:p>
     <w:p>
@@ -1262,25 +1282,7 @@
                 <w:szCs w:val="30"/>
                 <w:lang w:val="vi-VN"/>
               </w:rPr>
-              <w:t>Check Github TV</w:t>
-            </w:r>
-            <w:r>
-              <w:rPr>
-                <w:rFonts w:ascii="Times New Roman" w:eastAsia="Meiryo" w:hAnsi="Times New Roman" w:cs="Times New Roman"/>
-                <w:sz w:val="30"/>
-                <w:szCs w:val="30"/>
-                <w:lang w:val="vi-VN"/>
-              </w:rPr>
-              <w:t>2</w:t>
-            </w:r>
-            <w:r>
-              <w:rPr>
-                <w:rFonts w:ascii="Times New Roman" w:eastAsia="Meiryo" w:hAnsi="Times New Roman" w:cs="Times New Roman"/>
-                <w:sz w:val="30"/>
-                <w:szCs w:val="30"/>
-                <w:lang w:val="vi-VN"/>
-              </w:rPr>
-              <w:t xml:space="preserve"> đã Push, xác nhận đã chạy được trên máy mình </w:t>
+              <w:t xml:space="preserve">Check Github TV2 đã Push, xác nhận đã chạy được trên máy mình </w:t>
             </w:r>
           </w:p>
         </w:tc>
@@ -1601,25 +1603,7 @@
                 <w:szCs w:val="30"/>
                 <w:lang w:val="vi-VN"/>
               </w:rPr>
-              <w:t>Check Github TV</w:t>
-            </w:r>
-            <w:r>
-              <w:rPr>
-                <w:rFonts w:ascii="Times New Roman" w:eastAsia="Meiryo" w:hAnsi="Times New Roman" w:cs="Times New Roman"/>
-                <w:sz w:val="30"/>
-                <w:szCs w:val="30"/>
-                <w:lang w:val="vi-VN"/>
-              </w:rPr>
-              <w:t>3</w:t>
-            </w:r>
-            <w:r>
-              <w:rPr>
-                <w:rFonts w:ascii="Times New Roman" w:eastAsia="Meiryo" w:hAnsi="Times New Roman" w:cs="Times New Roman"/>
-                <w:sz w:val="30"/>
-                <w:szCs w:val="30"/>
-                <w:lang w:val="vi-VN"/>
-              </w:rPr>
-              <w:t xml:space="preserve"> đã Push, xác nhận đã chạy được trên máy mình </w:t>
+              <w:t xml:space="preserve">Check Github TV3 đã Push, xác nhận đã chạy được trên máy mình </w:t>
             </w:r>
           </w:p>
         </w:tc>
@@ -1657,8 +1641,6 @@
           <w:lang w:val="vi-VN"/>
         </w:rPr>
       </w:pPr>
-      <w:bookmarkStart w:id="0" w:name="_GoBack"/>
-      <w:bookmarkEnd w:id="0"/>
     </w:p>
     <w:p>
       <w:pPr>
@@ -1995,25 +1977,7 @@
                 <w:szCs w:val="30"/>
                 <w:lang w:val="vi-VN"/>
               </w:rPr>
-              <w:t>Check Github TV</w:t>
-            </w:r>
-            <w:r>
-              <w:rPr>
-                <w:rFonts w:ascii="Times New Roman" w:eastAsia="Meiryo" w:hAnsi="Times New Roman" w:cs="Times New Roman"/>
-                <w:sz w:val="30"/>
-                <w:szCs w:val="30"/>
-                <w:lang w:val="vi-VN"/>
-              </w:rPr>
-              <w:t>4</w:t>
-            </w:r>
-            <w:r>
-              <w:rPr>
-                <w:rFonts w:ascii="Times New Roman" w:eastAsia="Meiryo" w:hAnsi="Times New Roman" w:cs="Times New Roman"/>
-                <w:sz w:val="30"/>
-                <w:szCs w:val="30"/>
-                <w:lang w:val="vi-VN"/>
-              </w:rPr>
-              <w:t xml:space="preserve"> đã Push, xác nhận đã chạy được trên máy mình </w:t>
+              <w:t xml:space="preserve">Check Github TV4 đã Push, xác nhận đã chạy được trên máy mình </w:t>
             </w:r>
           </w:p>
         </w:tc>

</xml_diff>